<commit_message>
Update integrated package DOI and final preprint files
</commit_message>
<xml_diff>
--- a/submission/Chang_2026f_Voynich_MultiLevel_Integrated_Cryptologia_Submission.docx
+++ b/submission/Chang_2026f_Voynich_MultiLevel_Integrated_Cryptologia_Submission.docx
@@ -10,7 +10,7 @@
         <w:rPr>
           <w:rFonts w:ascii="Times New Roman" w:hAnsi="Times New Roman"/>
           <w:b/>
-          <w:sz w:val="28"/>
+          <w:sz w:val="22"/>
         </w:rPr>
         <w:t>Multi-Level Statistical Constraints in the Voynich Manuscript:</w:t>
         <w:br/>
@@ -26,7 +26,7 @@
           <w:rFonts w:ascii="Times New Roman" w:hAnsi="Times New Roman"/>
           <w:b/>
           <w:i w:val="0"/>
-          <w:sz w:val="20"/>
+          <w:sz w:val="22"/>
         </w:rPr>
         <w:t>Youngsan Chang</w:t>
       </w:r>
@@ -40,7 +40,7 @@
           <w:rFonts w:ascii="Times New Roman" w:hAnsi="Times New Roman"/>
           <w:b w:val="0"/>
           <w:i/>
-          <w:sz w:val="20"/>
+          <w:sz w:val="22"/>
         </w:rPr>
         <w:t>Independent Researcher</w:t>
       </w:r>
@@ -54,7 +54,7 @@
           <w:rFonts w:ascii="Times New Roman" w:hAnsi="Times New Roman"/>
           <w:b w:val="0"/>
           <w:i/>
-          <w:sz w:val="20"/>
+          <w:sz w:val="22"/>
         </w:rPr>
         <w:t>April 2026</w:t>
       </w:r>
@@ -68,7 +68,7 @@
           <w:rFonts w:ascii="Times New Roman" w:hAnsi="Times New Roman"/>
           <w:b w:val="0"/>
           <w:i/>
-          <w:sz w:val="20"/>
+          <w:sz w:val="22"/>
         </w:rPr>
         <w:t>Data source: Zandbergen-Landini EVA transcription (ZL3b)</w:t>
       </w:r>
@@ -81,6 +81,7 @@
         <w:rPr>
           <w:rFonts w:ascii="Times New Roman" w:hAnsi="Times New Roman"/>
           <w:b/>
+          <w:sz w:val="22"/>
         </w:rPr>
         <w:t>AI Use Disclosure</w:t>
       </w:r>
@@ -107,6 +108,7 @@
         <w:rPr>
           <w:rFonts w:ascii="Times New Roman" w:hAnsi="Times New Roman"/>
           <w:b/>
+          <w:sz w:val="22"/>
         </w:rPr>
         <w:t>Abstract</w:t>
       </w:r>
@@ -147,6 +149,7 @@
         <w:rPr>
           <w:rFonts w:ascii="Times New Roman" w:hAnsi="Times New Roman"/>
           <w:b/>
+          <w:sz w:val="22"/>
         </w:rPr>
         <w:t>1. Introduction</w:t>
       </w:r>
@@ -229,6 +232,7 @@
         <w:rPr>
           <w:rFonts w:ascii="Times New Roman" w:hAnsi="Times New Roman"/>
           <w:b/>
+          <w:sz w:val="22"/>
         </w:rPr>
         <w:t>2. Literature Review</w:t>
       </w:r>
@@ -241,6 +245,7 @@
         <w:rPr>
           <w:rFonts w:ascii="Times New Roman" w:hAnsi="Times New Roman"/>
           <w:b/>
+          <w:sz w:val="22"/>
         </w:rPr>
         <w:t>2.1 Statistical approaches to the Voynich Manuscript</w:t>
       </w:r>
@@ -281,6 +286,7 @@
         <w:rPr>
           <w:rFonts w:ascii="Times New Roman" w:hAnsi="Times New Roman"/>
           <w:b/>
+          <w:sz w:val="22"/>
         </w:rPr>
         <w:t>2.2 Generative and pseudo-text explanations</w:t>
       </w:r>
@@ -321,6 +327,7 @@
         <w:rPr>
           <w:rFonts w:ascii="Times New Roman" w:hAnsi="Times New Roman"/>
           <w:b/>
+          <w:sz w:val="22"/>
         </w:rPr>
         <w:t>2.3 Token morphology and slot-based models</w:t>
       </w:r>
@@ -361,6 +368,7 @@
         <w:rPr>
           <w:rFonts w:ascii="Times New Roman" w:hAnsi="Times New Roman"/>
           <w:b/>
+          <w:sz w:val="22"/>
         </w:rPr>
         <w:t>2.4 From isolated statistics to multi-level structure</w:t>
       </w:r>
@@ -387,6 +395,7 @@
         <w:rPr>
           <w:rFonts w:ascii="Times New Roman" w:hAnsi="Times New Roman"/>
           <w:b/>
+          <w:sz w:val="22"/>
         </w:rPr>
         <w:t>3. Research Questions</w:t>
       </w:r>
@@ -497,6 +506,7 @@
         <w:rPr>
           <w:rFonts w:ascii="Times New Roman" w:hAnsi="Times New Roman"/>
           <w:b/>
+          <w:sz w:val="22"/>
         </w:rPr>
         <w:t>4. Data</w:t>
       </w:r>
@@ -551,6 +561,7 @@
         <w:rPr>
           <w:rFonts w:ascii="Times New Roman" w:hAnsi="Times New Roman"/>
           <w:b/>
+          <w:sz w:val="22"/>
         </w:rPr>
         <w:t>Table 1. Study Overview</w:t>
       </w:r>
@@ -1099,7 +1110,7 @@
         <w:rPr>
           <w:rFonts w:ascii="Times New Roman" w:hAnsi="Times New Roman"/>
           <w:i/>
-          <w:sz w:val="18"/>
+          <w:sz w:val="22"/>
         </w:rPr>
         <w:t>Table 1. Overview of the five component studies. Each study tests a distinct structural level rather than repeating a single global non-randomness claim.</w:t>
       </w:r>
@@ -1112,6 +1123,7 @@
         <w:rPr>
           <w:rFonts w:ascii="Times New Roman" w:hAnsi="Times New Roman"/>
           <w:b/>
+          <w:sz w:val="22"/>
         </w:rPr>
         <w:t>5. Methods</w:t>
       </w:r>
@@ -1138,6 +1150,7 @@
         <w:rPr>
           <w:rFonts w:ascii="Times New Roman" w:hAnsi="Times New Roman"/>
           <w:b/>
+          <w:sz w:val="22"/>
         </w:rPr>
         <w:t>Table 2. Methods: Corpus and Preprocessing</w:t>
       </w:r>
@@ -1558,7 +1571,7 @@
         <w:rPr>
           <w:rFonts w:ascii="Times New Roman" w:hAnsi="Times New Roman"/>
           <w:i/>
-          <w:sz w:val="18"/>
+          <w:sz w:val="22"/>
         </w:rPr>
         <w:t>Table 2. Methods summary: corpus and preprocessing. The table separates corpus scope and preprocessing rules because the component studies use task-specific working subsets.</w:t>
       </w:r>
@@ -1571,6 +1584,7 @@
         <w:rPr>
           <w:rFonts w:ascii="Times New Roman" w:hAnsi="Times New Roman"/>
           <w:b/>
+          <w:sz w:val="22"/>
         </w:rPr>
         <w:t>Table 3. Methods: Analytical Design</w:t>
       </w:r>
@@ -2119,7 +2133,7 @@
         <w:rPr>
           <w:rFonts w:ascii="Times New Roman" w:hAnsi="Times New Roman"/>
           <w:i/>
-          <w:sz w:val="18"/>
+          <w:sz w:val="22"/>
         </w:rPr>
         <w:t>Table 3. Methods summary: analytical design. Baselines and tests are listed compactly; detailed reproduction materials are linked through the component package DOI records.</w:t>
       </w:r>
@@ -2132,6 +2146,7 @@
         <w:rPr>
           <w:rFonts w:ascii="Times New Roman" w:hAnsi="Times New Roman"/>
           <w:b/>
+          <w:sz w:val="22"/>
         </w:rPr>
         <w:t>5.1 Positional constraint testing</w:t>
       </w:r>
@@ -2172,6 +2187,7 @@
         <w:rPr>
           <w:rFonts w:ascii="Times New Roman" w:hAnsi="Times New Roman"/>
           <w:b/>
+          <w:sz w:val="22"/>
         </w:rPr>
         <w:t>5.2 Comparative predictability analysis</w:t>
       </w:r>
@@ -2198,6 +2214,7 @@
         <w:rPr>
           <w:rFonts w:ascii="Times New Roman" w:hAnsi="Times New Roman"/>
           <w:b/>
+          <w:sz w:val="22"/>
         </w:rPr>
         <w:t>5.3 Prefix-core-suffix conditional analysis</w:t>
       </w:r>
@@ -2224,6 +2241,7 @@
         <w:rPr>
           <w:rFonts w:ascii="Times New Roman" w:hAnsi="Times New Roman"/>
           <w:b/>
+          <w:sz w:val="22"/>
         </w:rPr>
         <w:t>5.4 PCS token-generation modeling</w:t>
       </w:r>
@@ -2250,6 +2268,7 @@
         <w:rPr>
           <w:rFonts w:ascii="Times New Roman" w:hAnsi="Times New Roman"/>
           <w:b/>
+          <w:sz w:val="22"/>
         </w:rPr>
         <w:t>5.5 Inter-token sequence analysis</w:t>
       </w:r>
@@ -2276,6 +2295,7 @@
         <w:rPr>
           <w:rFonts w:ascii="Times New Roman" w:hAnsi="Times New Roman"/>
           <w:b/>
+          <w:sz w:val="22"/>
         </w:rPr>
         <w:t>6. Results</w:t>
       </w:r>
@@ -2288,6 +2308,7 @@
         <w:rPr>
           <w:rFonts w:ascii="Times New Roman" w:hAnsi="Times New Roman"/>
           <w:b/>
+          <w:sz w:val="22"/>
         </w:rPr>
         <w:t>6.1 Positional constraints are robust under null models</w:t>
       </w:r>
@@ -2328,6 +2349,7 @@
         <w:rPr>
           <w:rFonts w:ascii="Times New Roman" w:hAnsi="Times New Roman"/>
           <w:b/>
+          <w:sz w:val="22"/>
         </w:rPr>
         <w:t>6.2 Voynich tokens are predictability-like but structurally divergent</w:t>
       </w:r>
@@ -2368,6 +2390,7 @@
         <w:rPr>
           <w:rFonts w:ascii="Times New Roman" w:hAnsi="Times New Roman"/>
           <w:b/>
+          <w:sz w:val="22"/>
         </w:rPr>
         <w:t>6.3 PCS components show asymmetric conditional dependency</w:t>
       </w:r>
@@ -2405,6 +2428,10 @@
         <w:jc w:val="center"/>
       </w:pPr>
       <w:r>
+        <w:rPr>
+          <w:rFonts w:ascii="Times New Roman" w:hAnsi="Times New Roman"/>
+          <w:sz w:val="22"/>
+        </w:rPr>
         <w:drawing>
           <wp:inline xmlns:a="http://schemas.openxmlformats.org/drawingml/2006/main" xmlns:pic="http://schemas.openxmlformats.org/drawingml/2006/picture">
             <wp:extent cx="5394960" cy="3416808"/>
@@ -2447,7 +2474,7 @@
         <w:rPr>
           <w:rFonts w:ascii="Times New Roman" w:hAnsi="Times New Roman"/>
           <w:i/>
-          <w:sz w:val="18"/>
+          <w:sz w:val="22"/>
         </w:rPr>
         <w:t>Figure 1. Conditional entropy in PCS components. The comparison supports the interpretation that the operationally defined core is a major conditioning element for suffix selection, without implying that the core has been semantically deciphered.</w:t>
       </w:r>
@@ -2474,6 +2501,7 @@
         <w:rPr>
           <w:rFonts w:ascii="Times New Roman" w:hAnsi="Times New Roman"/>
           <w:b/>
+          <w:sz w:val="22"/>
         </w:rPr>
         <w:t>6.4 PCS generation reproduces observed token structure</w:t>
       </w:r>
@@ -2497,6 +2525,10 @@
         <w:jc w:val="center"/>
       </w:pPr>
       <w:r>
+        <w:rPr>
+          <w:rFonts w:ascii="Times New Roman" w:hAnsi="Times New Roman"/>
+          <w:sz w:val="22"/>
+        </w:rPr>
         <w:drawing>
           <wp:inline xmlns:a="http://schemas.openxmlformats.org/drawingml/2006/main" xmlns:pic="http://schemas.openxmlformats.org/drawingml/2006/picture">
             <wp:extent cx="5394960" cy="3416808"/>
@@ -2539,7 +2571,7 @@
         <w:rPr>
           <w:rFonts w:ascii="Times New Roman" w:hAnsi="Times New Roman"/>
           <w:i/>
-          <w:sz w:val="18"/>
+          <w:sz w:val="22"/>
         </w:rPr>
         <w:t>Figure 2. PCS generation matching rate. The PCS model reproduces observed token forms at a substantially higher rate than the random baseline.</w:t>
       </w:r>
@@ -2563,6 +2595,10 @@
         <w:jc w:val="center"/>
       </w:pPr>
       <w:r>
+        <w:rPr>
+          <w:rFonts w:ascii="Times New Roman" w:hAnsi="Times New Roman"/>
+          <w:sz w:val="22"/>
+        </w:rPr>
         <w:drawing>
           <wp:inline xmlns:a="http://schemas.openxmlformats.org/drawingml/2006/main" xmlns:pic="http://schemas.openxmlformats.org/drawingml/2006/picture">
             <wp:extent cx="5394960" cy="3416808"/>
@@ -2605,7 +2641,7 @@
         <w:rPr>
           <w:rFonts w:ascii="Times New Roman" w:hAnsi="Times New Roman"/>
           <w:i/>
-          <w:sz w:val="18"/>
+          <w:sz w:val="22"/>
         </w:rPr>
         <w:t>Figure 3. Token mass coverage. The PCS model captures much more observed token mass than the random baseline.</w:t>
       </w:r>
@@ -2629,6 +2665,10 @@
         <w:jc w:val="center"/>
       </w:pPr>
       <w:r>
+        <w:rPr>
+          <w:rFonts w:ascii="Times New Roman" w:hAnsi="Times New Roman"/>
+          <w:sz w:val="22"/>
+        </w:rPr>
         <w:drawing>
           <wp:inline xmlns:a="http://schemas.openxmlformats.org/drawingml/2006/main" xmlns:pic="http://schemas.openxmlformats.org/drawingml/2006/picture">
             <wp:extent cx="5394960" cy="3416808"/>
@@ -2671,7 +2711,7 @@
         <w:rPr>
           <w:rFonts w:ascii="Times New Roman" w:hAnsi="Times New Roman"/>
           <w:i/>
-          <w:sz w:val="18"/>
+          <w:sz w:val="22"/>
         </w:rPr>
         <w:t>Figure 4. Zipf slope difference. Lower difference indicates closer agreement with the observed rank-frequency profile.</w:t>
       </w:r>
@@ -2709,6 +2749,10 @@
         <w:jc w:val="center"/>
       </w:pPr>
       <w:r>
+        <w:rPr>
+          <w:rFonts w:ascii="Times New Roman" w:hAnsi="Times New Roman"/>
+          <w:sz w:val="22"/>
+        </w:rPr>
         <w:drawing>
           <wp:inline xmlns:a="http://schemas.openxmlformats.org/drawingml/2006/main" xmlns:pic="http://schemas.openxmlformats.org/drawingml/2006/picture">
             <wp:extent cx="5394960" cy="3416808"/>
@@ -2751,7 +2795,7 @@
         <w:rPr>
           <w:rFonts w:ascii="Times New Roman" w:hAnsi="Times New Roman"/>
           <w:i/>
-          <w:sz w:val="18"/>
+          <w:sz w:val="22"/>
         </w:rPr>
         <w:t>Figure 5. Compression ratio comparison. Lower compression ratios indicate greater regularity; the PCS-generated corpus remains closer to the real corpus than to the shuffled baseline.</w:t>
       </w:r>
@@ -2764,6 +2808,7 @@
         <w:rPr>
           <w:rFonts w:ascii="Times New Roman" w:hAnsi="Times New Roman"/>
           <w:b/>
+          <w:sz w:val="22"/>
         </w:rPr>
         <w:t>6.5 Inter-token arrangement is non-random</w:t>
       </w:r>
@@ -2801,6 +2846,10 @@
         <w:jc w:val="center"/>
       </w:pPr>
       <w:r>
+        <w:rPr>
+          <w:rFonts w:ascii="Times New Roman" w:hAnsi="Times New Roman"/>
+          <w:sz w:val="22"/>
+        </w:rPr>
         <w:drawing>
           <wp:inline xmlns:a="http://schemas.openxmlformats.org/drawingml/2006/main" xmlns:pic="http://schemas.openxmlformats.org/drawingml/2006/picture">
             <wp:extent cx="5394960" cy="3117088"/>
@@ -2843,7 +2892,7 @@
         <w:rPr>
           <w:rFonts w:ascii="Times New Roman" w:hAnsi="Times New Roman"/>
           <w:i/>
-          <w:sz w:val="18"/>
+          <w:sz w:val="22"/>
         </w:rPr>
         <w:t>Figure 6. Inter-token entropy and next-token prediction from Chang (2026e). Real sequences show lower bigram entropy and higher next-token prediction accuracy than the line-internal shuffled baseline.</w:t>
       </w:r>
@@ -2884,6 +2933,7 @@
         <w:rPr>
           <w:rFonts w:ascii="Times New Roman" w:hAnsi="Times New Roman"/>
           <w:b/>
+          <w:sz w:val="22"/>
         </w:rPr>
         <w:t>6.6 Integrated result</w:t>
       </w:r>
@@ -2924,6 +2974,7 @@
         <w:rPr>
           <w:rFonts w:ascii="Times New Roman" w:hAnsi="Times New Roman"/>
           <w:b/>
+          <w:sz w:val="22"/>
         </w:rPr>
         <w:t>Table 4. Integrated Evidence Matrix</w:t>
       </w:r>
@@ -3539,7 +3590,7 @@
         <w:rPr>
           <w:rFonts w:ascii="Times New Roman" w:hAnsi="Times New Roman"/>
           <w:i/>
-          <w:sz w:val="18"/>
+          <w:sz w:val="22"/>
         </w:rPr>
         <w:t>Table 4. Integrated evidence across structural levels. The evidence is interpreted as coordinated structural organization, not semantic decipherment.</w:t>
       </w:r>
@@ -3566,6 +3617,7 @@
         <w:rPr>
           <w:rFonts w:ascii="Times New Roman" w:hAnsi="Times New Roman"/>
           <w:b/>
+          <w:sz w:val="22"/>
         </w:rPr>
         <w:t>Table 5. Key Quantitative Findings</w:t>
       </w:r>
@@ -4458,7 +4510,7 @@
         <w:rPr>
           <w:rFonts w:ascii="Times New Roman" w:hAnsi="Times New Roman"/>
           <w:i/>
-          <w:sz w:val="18"/>
+          <w:sz w:val="22"/>
         </w:rPr>
         <w:t>Table 5. Key quantitative findings summary. Values are drawn from the component studies and are used as cross-level constraints for future models.</w:t>
       </w:r>
@@ -4471,6 +4523,7 @@
         <w:rPr>
           <w:rFonts w:ascii="Times New Roman" w:hAnsi="Times New Roman"/>
           <w:b/>
+          <w:sz w:val="22"/>
         </w:rPr>
         <w:t>7. Discussion</w:t>
       </w:r>
@@ -4483,6 +4536,7 @@
         <w:rPr>
           <w:rFonts w:ascii="Times New Roman" w:hAnsi="Times New Roman"/>
           <w:b/>
+          <w:sz w:val="22"/>
         </w:rPr>
         <w:t>7.1 From isolated regularities to a multi-level structural system</w:t>
       </w:r>
@@ -4523,6 +4577,7 @@
         <w:rPr>
           <w:rFonts w:ascii="Times New Roman" w:hAnsi="Times New Roman"/>
           <w:b/>
+          <w:sz w:val="22"/>
         </w:rPr>
         <w:t>7.2 The role of the core component</w:t>
       </w:r>
@@ -4563,6 +4618,7 @@
         <w:rPr>
           <w:rFonts w:ascii="Times New Roman" w:hAnsi="Times New Roman"/>
           <w:b/>
+          <w:sz w:val="22"/>
         </w:rPr>
         <w:t>7.3 What the results do not show</w:t>
       </w:r>
@@ -4603,6 +4659,7 @@
         <w:rPr>
           <w:rFonts w:ascii="Times New Roman" w:hAnsi="Times New Roman"/>
           <w:b/>
+          <w:sz w:val="22"/>
         </w:rPr>
         <w:t>7.4 Implications for future models</w:t>
       </w:r>
@@ -4643,6 +4700,7 @@
         <w:rPr>
           <w:rFonts w:ascii="Times New Roman" w:hAnsi="Times New Roman"/>
           <w:b/>
+          <w:sz w:val="22"/>
         </w:rPr>
         <w:t>8. Limitations</w:t>
       </w:r>
@@ -4739,6 +4797,7 @@
         <w:rPr>
           <w:rFonts w:ascii="Times New Roman" w:hAnsi="Times New Roman"/>
           <w:b/>
+          <w:sz w:val="22"/>
         </w:rPr>
         <w:t>9. Conclusion</w:t>
       </w:r>
@@ -4779,6 +4838,7 @@
         <w:rPr>
           <w:rFonts w:ascii="Times New Roman" w:hAnsi="Times New Roman"/>
           <w:b/>
+          <w:sz w:val="22"/>
         </w:rPr>
         <w:t>10. Future Work</w:t>
       </w:r>
@@ -4833,6 +4893,7 @@
         <w:rPr>
           <w:rFonts w:ascii="Times New Roman" w:hAnsi="Times New Roman"/>
           <w:b/>
+          <w:sz w:val="22"/>
         </w:rPr>
         <w:t>Data and Code Availability</w:t>
       </w:r>
@@ -4844,11 +4905,9 @@
       <w:r>
         <w:rPr>
           <w:rFonts w:ascii="Times New Roman" w:hAnsi="Times New Roman"/>
-          <w:b w:val="0"/>
-          <w:i w:val="0"/>
           <w:sz w:val="22"/>
         </w:rPr>
-        <w:t>This integrated manuscript synthesizes five component studies. The component paper DOI records and component reproduction package DOI records are intentionally distinct: paper DOI records identify manuscripts, while package DOI records identify associated code, data, figures, tables, and reproduction materials.</w:t>
+        <w:t>The integrated reproduction package for the present manuscript is archived on Zenodo at https://doi.org/10.5281/zenodo.19876003. This integrated package contains the manuscript source, final figures, final tables, methods summary materials, submission-support files, and documentation for the Chang 2026f synthesis.</w:t>
       </w:r>
     </w:p>
     <w:p>
@@ -4901,6 +4960,7 @@
         <w:rPr>
           <w:rFonts w:ascii="Times New Roman" w:hAnsi="Times New Roman"/>
           <w:b/>
+          <w:sz w:val="22"/>
         </w:rPr>
         <w:t>Funding</w:t>
       </w:r>
@@ -4927,6 +4987,7 @@
         <w:rPr>
           <w:rFonts w:ascii="Times New Roman" w:hAnsi="Times New Roman"/>
           <w:b/>
+          <w:sz w:val="22"/>
         </w:rPr>
         <w:t>Competing Interests</w:t>
       </w:r>
@@ -4953,6 +5014,7 @@
         <w:rPr>
           <w:rFonts w:ascii="Times New Roman" w:hAnsi="Times New Roman"/>
           <w:b/>
+          <w:sz w:val="22"/>
         </w:rPr>
         <w:t>Ethics Statement</w:t>
       </w:r>
@@ -4979,6 +5041,7 @@
         <w:rPr>
           <w:rFonts w:ascii="Times New Roman" w:hAnsi="Times New Roman"/>
           <w:b/>
+          <w:sz w:val="22"/>
         </w:rPr>
         <w:t>Acknowledgements</w:t>
       </w:r>
@@ -5005,6 +5068,7 @@
         <w:rPr>
           <w:rFonts w:ascii="Times New Roman" w:hAnsi="Times New Roman"/>
           <w:b/>
+          <w:sz w:val="22"/>
         </w:rPr>
         <w:t>References</w:t>
       </w:r>

</xml_diff>

<commit_message>
Update integrated paper DOI and final submission materials
</commit_message>
<xml_diff>
--- a/submission/Chang_2026f_Voynich_MultiLevel_Integrated_Cryptologia_Submission.docx
+++ b/submission/Chang_2026f_Voynich_MultiLevel_Integrated_Cryptologia_Submission.docx
@@ -4899,57 +4899,30 @@
       </w:r>
     </w:p>
     <w:p>
-      <w:pPr>
-        <w:spacing w:after="120" w:line="252" w:lineRule="auto"/>
-      </w:pPr>
       <w:r>
         <w:rPr>
           <w:rFonts w:ascii="Times New Roman" w:hAnsi="Times New Roman"/>
           <w:sz w:val="22"/>
         </w:rPr>
-        <w:t>The integrated reproduction package for the present manuscript is archived on Zenodo at https://doi.org/10.5281/zenodo.19876003. This integrated package contains the manuscript source, final figures, final tables, methods summary materials, submission-support files, and documentation for the Chang 2026f synthesis.</w:t>
+        <w:t>The integrated preprint manuscript is archived on Zenodo at https://doi.org/10.5281/zenodo.19877135. The integrated reproduction package for the present manuscript is archived separately on Zenodo at https://doi.org/10.5281/zenodo.19876003. This package contains the manuscript source, final figures, final tables, methods summary materials, submission-support files, and documentation for the Chang 2026f synthesis. Component paper-level DOI records and component package DOI records are listed separately because they refer to the five underlying component studies and their associated reproduction materials.</w:t>
       </w:r>
     </w:p>
     <w:p>
-      <w:pPr>
-        <w:spacing w:after="120" w:line="252" w:lineRule="auto"/>
-      </w:pPr>
       <w:r>
         <w:rPr>
           <w:rFonts w:ascii="Times New Roman" w:hAnsi="Times New Roman"/>
-          <w:b w:val="0"/>
-          <w:i w:val="0"/>
           <w:sz w:val="22"/>
         </w:rPr>
         <w:t>Component paper DOIs are as follows: Paper 1, https://doi.org/10.5281/zenodo.19687875; Paper 2, https://doi.org/10.5281/zenodo.19737888; Paper 3, https://doi.org/10.5281/zenodo.19765707; Paper 4, https://doi.org/10.5281/zenodo.19858094; Paper 5, https://doi.org/10.5281/zenodo.19869629.</w:t>
       </w:r>
     </w:p>
     <w:p>
-      <w:pPr>
-        <w:spacing w:after="120" w:line="252" w:lineRule="auto"/>
-      </w:pPr>
       <w:r>
         <w:rPr>
           <w:rFonts w:ascii="Times New Roman" w:hAnsi="Times New Roman"/>
-          <w:b w:val="0"/>
-          <w:i w:val="0"/>
           <w:sz w:val="22"/>
         </w:rPr>
         <w:t>Component package DOI records are as follows: Paper 1 package/concept, https://doi.org/10.5281/zenodo.19689753; Paper 2 package, https://doi.org/10.5281/zenodo.19737444; Paper 3 package, https://doi.org/10.5281/zenodo.19765403; Paper 4 package, https://doi.org/10.5281/zenodo.19857820; Paper 5 package, https://doi.org/10.5281/zenodo.19869615.</w:t>
-      </w:r>
-    </w:p>
-    <w:p>
-      <w:pPr>
-        <w:spacing w:after="120" w:line="252" w:lineRule="auto"/>
-      </w:pPr>
-      <w:r>
-        <w:rPr>
-          <w:rFonts w:ascii="Times New Roman" w:hAnsi="Times New Roman"/>
-          <w:b w:val="0"/>
-          <w:i w:val="0"/>
-          <w:sz w:val="22"/>
-        </w:rPr>
-        <w:t>The package DOI records point specifically to data/code repositories and derived reproduction materials; they are separate from the preprint DOI records listed in the References.</w:t>
       </w:r>
     </w:p>
     <w:p>

</xml_diff>